<commit_message>
docs: include official dbdiagram export in presentation package
</commit_message>
<xml_diff>
--- a/docs/NOI-DUNG-THUYET-TRINH-BUOC-1-2.docx
+++ b/docs/NOI-DUNG-THUYET-TRINH-BUOC-1-2.docx
@@ -4226,6 +4226,35 @@
     </w:p>
     <w:p>
       <w:pPr>
+        <w:pStyle w:val="Heading2"/>
+      </w:pPr>
+      <w:r>
+        <w:t>Slide 22 — ERD tổng thể — 17 bảng</w:t>
+      </w:r>
+    </w:p>
+    <w:p>
+      <w:pPr>
+        <w:pStyle w:val="ListBullet"/>
+      </w:pPr>
+      <w:r>
+        <w:t>17 bảng, 138 cột và 28 khóa ngoại; cùng mô hình với các ERD chi tiết.</w:t>
+      </w:r>
+    </w:p>
+    <w:p>
+      <w:pPr>
+        <w:pStyle w:val="ListBullet"/>
+      </w:pPr>
+      <w:r>
+        <w:t>Bản xuất chính thức từ dbdiagram.io: diagrams/quanlytro-dbdiagram-official.svg.</w:t>
+      </w:r>
+    </w:p>
+    <w:p>
+      <w:r>
+        <w:br w:type="page"/>
+      </w:r>
+    </w:p>
+    <w:p>
+      <w:pPr>
         <w:pStyle w:val="Heading1"/>
       </w:pPr>
       <w:r>
@@ -7166,7 +7195,7 @@
         <w:pStyle w:val="ListBullet"/>
       </w:pPr>
       <w:r>
-        <w:t>ERD PDF.</w:t>
+        <w:t>ERD chính thức — SVG, PNG, PDF.</w:t>
       </w:r>
     </w:p>
     <w:p>

</xml_diff>

<commit_message>
docs: review presentation and highlight public ERD for submission
</commit_message>
<xml_diff>
--- a/docs/NOI-DUNG-THUYET-TRINH-BUOC-1-2.docx
+++ b/docs/NOI-DUNG-THUYET-TRINH-BUOC-1-2.docx
@@ -36,7 +36,19 @@
         <w:t>Nhóm:</w:t>
       </w:r>
       <w:r>
-        <w:t xml:space="preserve"> ………………………………</w:t>
+        <w:t xml:space="preserve"> gehihi</w:t>
+      </w:r>
+    </w:p>
+    <w:p>
+      <w:r/>
+      <w:r>
+        <w:rPr>
+          <w:b/>
+        </w:rPr>
+        <w:t>Thành viên:</w:t>
+      </w:r>
+      <w:r>
+        <w:t xml:space="preserve"> Nguyễn Doãn Huy, Phan Văn Hiếu, Nguyễn Trần Tuấn Khôi, Nie Phương Anh, Trần Đức Nguyên, Nguyễn Quang Trung.</w:t>
       </w:r>
     </w:p>
     <w:p>
@@ -74,6 +86,22 @@
       </w:pPr>
       <w:r>
         <w:t>Một chủ nhà, nhiều khu; ba tác nhân ADMIN / STAFF / TENANT</w:t>
+      </w:r>
+    </w:p>
+    <w:p>
+      <w:pPr>
+        <w:pStyle w:val="ListBullet"/>
+      </w:pPr>
+      <w:r>
+        <w:t>Nhóm: gehihi</w:t>
+      </w:r>
+    </w:p>
+    <w:p>
+      <w:pPr>
+        <w:pStyle w:val="ListBullet"/>
+      </w:pPr>
+      <w:r>
+        <w:t>Thành viên: Nguyễn Doãn Huy, Phan Văn Hiếu, Nguyễn Trần Tuấn Khôi, Nie Phương Anh, Trần Đức Nguyên, Nguyễn Quang Trung</w:t>
       </w:r>
     </w:p>
     <w:p>
@@ -348,7 +376,7 @@
               <w:rPr>
                 <w:sz w:val="18"/>
               </w:rPr>
-              <w:t>Xem hợp đồng, hóa đơn, giao dịch; gửi và theo dõi sự cố</w:t>
+              <w:t>Xem hợp đồng, hóa đơn đã phát hành, giao dịch; gửi và theo dõi sự cố</w:t>
             </w:r>
           </w:p>
         </w:tc>
@@ -594,7 +622,7 @@
               <w:rPr>
                 <w:sz w:val="18"/>
               </w:rPr>
-              <w:t>Tạo khu/phòng; cập nhật phòng; chuyển phòng bảo trì</w:t>
+              <w:t>Tạo, cập nhật khu/phòng; ngừng khu; xóa phòng chưa có phụ thuộc</w:t>
             </w:r>
           </w:p>
         </w:tc>
@@ -610,7 +638,7 @@
               <w:rPr>
                 <w:sz w:val="18"/>
               </w:rPr>
-              <w:t>ADMIN; STAFF theo quyền</w:t>
+              <w:t>ADMIN; STAFF chỉ sửa phòng trong khu được giao</w:t>
             </w:r>
           </w:p>
         </w:tc>
@@ -663,7 +691,7 @@
               <w:rPr>
                 <w:sz w:val="18"/>
               </w:rPr>
-              <w:t>ADMIN; tra cứu có giới hạn</w:t>
+              <w:t>ADMIN tạo/sửa; STAFF/TENANT xem theo phạm vi</w:t>
             </w:r>
           </w:p>
         </w:tc>
@@ -747,8 +775,9 @@
         <w:tblLook w:firstColumn="1" w:firstRow="1" w:lastColumn="0" w:lastRow="0" w:noHBand="0" w:noVBand="1" w:val="04A0"/>
       </w:tblPr>
       <w:tblGrid>
-        <w:gridCol w:w="5046"/>
-        <w:gridCol w:w="5046"/>
+        <w:gridCol w:w="3364"/>
+        <w:gridCol w:w="3364"/>
+        <w:gridCol w:w="3364"/>
       </w:tblGrid>
       <w:tr>
         <w:trPr>
@@ -757,7 +786,7 @@
         </w:trPr>
         <w:tc>
           <w:tcPr>
-            <w:tcW w:type="dxa" w:w="5046"/>
+            <w:tcW w:type="dxa" w:w="3364"/>
           </w:tcPr>
           <w:p>
             <w:pPr>
@@ -774,7 +803,7 @@
         </w:tc>
         <w:tc>
           <w:tcPr>
-            <w:tcW w:type="dxa" w:w="5046"/>
+            <w:tcW w:type="dxa" w:w="3364"/>
           </w:tcPr>
           <w:p>
             <w:pPr>
@@ -786,6 +815,23 @@
                 <w:sz w:val="18"/>
               </w:rPr>
               <w:t>Use Case chính</w:t>
+            </w:r>
+          </w:p>
+        </w:tc>
+        <w:tc>
+          <w:tcPr>
+            <w:tcW w:type="dxa" w:w="3364"/>
+          </w:tcPr>
+          <w:p>
+            <w:pPr>
+              <w:spacing w:after="60"/>
+            </w:pPr>
+            <w:r>
+              <w:rPr>
+                <w:b/>
+                <w:sz w:val="18"/>
+              </w:rPr>
+              <w:t>Tác nhân</w:t>
             </w:r>
           </w:p>
         </w:tc>
@@ -796,7 +842,7 @@
         </w:trPr>
         <w:tc>
           <w:tcPr>
-            <w:tcW w:type="dxa" w:w="5046"/>
+            <w:tcW w:type="dxa" w:w="3364"/>
           </w:tcPr>
           <w:p>
             <w:pPr>
@@ -812,7 +858,7 @@
         </w:tc>
         <w:tc>
           <w:tcPr>
-            <w:tcW w:type="dxa" w:w="5046"/>
+            <w:tcW w:type="dxa" w:w="3364"/>
           </w:tcPr>
           <w:p>
             <w:pPr>
@@ -823,6 +869,22 @@
                 <w:sz w:val="18"/>
               </w:rPr>
               <w:t>Thiết lập đơn giá và ngưỡng cảnh báo theo khu</w:t>
+            </w:r>
+          </w:p>
+        </w:tc>
+        <w:tc>
+          <w:tcPr>
+            <w:tcW w:type="dxa" w:w="3364"/>
+          </w:tcPr>
+          <w:p>
+            <w:pPr>
+              <w:spacing w:after="60"/>
+            </w:pPr>
+            <w:r>
+              <w:rPr>
+                <w:sz w:val="18"/>
+              </w:rPr>
+              <w:t>ADMIN</w:t>
             </w:r>
           </w:p>
         </w:tc>
@@ -833,7 +895,7 @@
         </w:trPr>
         <w:tc>
           <w:tcPr>
-            <w:tcW w:type="dxa" w:w="5046"/>
+            <w:tcW w:type="dxa" w:w="3364"/>
           </w:tcPr>
           <w:p>
             <w:pPr>
@@ -849,17 +911,33 @@
         </w:tc>
         <w:tc>
           <w:tcPr>
-            <w:tcW w:type="dxa" w:w="5046"/>
-          </w:tcPr>
-          <w:p>
-            <w:pPr>
-              <w:spacing w:after="60"/>
-            </w:pPr>
-            <w:r>
-              <w:rPr>
-                <w:sz w:val="18"/>
-              </w:rPr>
-              <w:t>Ghi chỉ số; sửa chỉ số cuối; kiểm tra cảnh báo</w:t>
+            <w:tcW w:type="dxa" w:w="3364"/>
+          </w:tcPr>
+          <w:p>
+            <w:pPr>
+              <w:spacing w:after="60"/>
+            </w:pPr>
+            <w:r>
+              <w:rPr>
+                <w:sz w:val="18"/>
+              </w:rPr>
+              <w:t>Ghi/sửa chỉ số cuối; kiểm tra cảnh báo</w:t>
+            </w:r>
+          </w:p>
+        </w:tc>
+        <w:tc>
+          <w:tcPr>
+            <w:tcW w:type="dxa" w:w="3364"/>
+          </w:tcPr>
+          <w:p>
+            <w:pPr>
+              <w:spacing w:after="60"/>
+            </w:pPr>
+            <w:r>
+              <w:rPr>
+                <w:sz w:val="18"/>
+              </w:rPr>
+              <w:t>ADMIN / STAFF</w:t>
             </w:r>
           </w:p>
         </w:tc>
@@ -870,7 +948,7 @@
         </w:trPr>
         <w:tc>
           <w:tcPr>
-            <w:tcW w:type="dxa" w:w="5046"/>
+            <w:tcW w:type="dxa" w:w="3364"/>
           </w:tcPr>
           <w:p>
             <w:pPr>
@@ -886,17 +964,33 @@
         </w:tc>
         <w:tc>
           <w:tcPr>
-            <w:tcW w:type="dxa" w:w="5046"/>
-          </w:tcPr>
-          <w:p>
-            <w:pPr>
-              <w:spacing w:after="60"/>
-            </w:pPr>
-            <w:r>
-              <w:rPr>
-                <w:sz w:val="18"/>
-              </w:rPr>
-              <w:t>Lập nháp; xóa nháp; phát hành; tra cứu hóa đơn</w:t>
+            <w:tcW w:type="dxa" w:w="3364"/>
+          </w:tcPr>
+          <w:p>
+            <w:pPr>
+              <w:spacing w:after="60"/>
+            </w:pPr>
+            <w:r>
+              <w:rPr>
+                <w:sz w:val="18"/>
+              </w:rPr>
+              <w:t>Lập/xóa nháp; phát hành; tra cứu hóa đơn</w:t>
+            </w:r>
+          </w:p>
+        </w:tc>
+        <w:tc>
+          <w:tcPr>
+            <w:tcW w:type="dxa" w:w="3364"/>
+          </w:tcPr>
+          <w:p>
+            <w:pPr>
+              <w:spacing w:after="60"/>
+            </w:pPr>
+            <w:r>
+              <w:rPr>
+                <w:sz w:val="18"/>
+              </w:rPr>
+              <w:t>ADMIN / STAFF; TENANT xem bản phát hành</w:t>
             </w:r>
           </w:p>
         </w:tc>
@@ -907,7 +1001,7 @@
         </w:trPr>
         <w:tc>
           <w:tcPr>
-            <w:tcW w:type="dxa" w:w="5046"/>
+            <w:tcW w:type="dxa" w:w="3364"/>
           </w:tcPr>
           <w:p>
             <w:pPr>
@@ -923,17 +1017,33 @@
         </w:tc>
         <w:tc>
           <w:tcPr>
-            <w:tcW w:type="dxa" w:w="5046"/>
-          </w:tcPr>
-          <w:p>
-            <w:pPr>
-              <w:spacing w:after="60"/>
-            </w:pPr>
-            <w:r>
-              <w:rPr>
-                <w:sz w:val="18"/>
-              </w:rPr>
-              <w:t>Ghi nhận thanh toán; tra cứu công nợ; tổng hợp tiền thu</w:t>
+            <w:tcW w:type="dxa" w:w="3364"/>
+          </w:tcPr>
+          <w:p>
+            <w:pPr>
+              <w:spacing w:after="60"/>
+            </w:pPr>
+            <w:r>
+              <w:rPr>
+                <w:sz w:val="18"/>
+              </w:rPr>
+              <w:t>Ghi nhận thanh toán; tra cứu công nợ; tổng hợp thu</w:t>
+            </w:r>
+          </w:p>
+        </w:tc>
+        <w:tc>
+          <w:tcPr>
+            <w:tcW w:type="dxa" w:w="3364"/>
+          </w:tcPr>
+          <w:p>
+            <w:pPr>
+              <w:spacing w:after="60"/>
+            </w:pPr>
+            <w:r>
+              <w:rPr>
+                <w:sz w:val="18"/>
+              </w:rPr>
+              <w:t>ADMIN / STAFF; TENANT xem của mình</w:t>
             </w:r>
           </w:p>
         </w:tc>
@@ -944,7 +1054,7 @@
         </w:trPr>
         <w:tc>
           <w:tcPr>
-            <w:tcW w:type="dxa" w:w="5046"/>
+            <w:tcW w:type="dxa" w:w="3364"/>
           </w:tcPr>
           <w:p>
             <w:pPr>
@@ -960,7 +1070,7 @@
         </w:tc>
         <w:tc>
           <w:tcPr>
-            <w:tcW w:type="dxa" w:w="5046"/>
+            <w:tcW w:type="dxa" w:w="3364"/>
           </w:tcPr>
           <w:p>
             <w:pPr>
@@ -971,6 +1081,22 @@
                 <w:sz w:val="18"/>
               </w:rPr>
               <w:t>Chốt kỳ cuối; quyết toán; cấn cọc; xác định hoàn/thu thêm</w:t>
+            </w:r>
+          </w:p>
+        </w:tc>
+        <w:tc>
+          <w:tcPr>
+            <w:tcW w:type="dxa" w:w="3364"/>
+          </w:tcPr>
+          <w:p>
+            <w:pPr>
+              <w:spacing w:after="60"/>
+            </w:pPr>
+            <w:r>
+              <w:rPr>
+                <w:sz w:val="18"/>
+              </w:rPr>
+              <w:t>ADMIN / STAFF</w:t>
             </w:r>
           </w:p>
         </w:tc>
@@ -981,7 +1107,7 @@
         </w:trPr>
         <w:tc>
           <w:tcPr>
-            <w:tcW w:type="dxa" w:w="5046"/>
+            <w:tcW w:type="dxa" w:w="3364"/>
           </w:tcPr>
           <w:p>
             <w:pPr>
@@ -997,17 +1123,33 @@
         </w:tc>
         <w:tc>
           <w:tcPr>
-            <w:tcW w:type="dxa" w:w="5046"/>
-          </w:tcPr>
-          <w:p>
-            <w:pPr>
-              <w:spacing w:after="60"/>
-            </w:pPr>
-            <w:r>
-              <w:rPr>
-                <w:sz w:val="18"/>
-              </w:rPr>
-              <w:t>Gửi yêu cầu; đính kèm ảnh; cập nhật và theo dõi tiến độ</w:t>
+            <w:tcW w:type="dxa" w:w="3364"/>
+          </w:tcPr>
+          <w:p>
+            <w:pPr>
+              <w:spacing w:after="60"/>
+            </w:pPr>
+            <w:r>
+              <w:rPr>
+                <w:sz w:val="18"/>
+              </w:rPr>
+              <w:t>Gửi yêu cầu; đính kèm ảnh; cập nhật, theo dõi tiến độ</w:t>
+            </w:r>
+          </w:p>
+        </w:tc>
+        <w:tc>
+          <w:tcPr>
+            <w:tcW w:type="dxa" w:w="3364"/>
+          </w:tcPr>
+          <w:p>
+            <w:pPr>
+              <w:spacing w:after="60"/>
+            </w:pPr>
+            <w:r>
+              <w:rPr>
+                <w:sz w:val="18"/>
+              </w:rPr>
+              <w:t>TENANT gửi; ADMIN / STAFF xử lý</w:t>
             </w:r>
           </w:p>
         </w:tc>
@@ -1737,7 +1879,7 @@
               <w:rPr>
                 <w:sz w:val="18"/>
               </w:rPr>
-              <w:t>Thập phân chính xác; làm tròn thành tiền</w:t>
+              <w:t>Số thập phân chính xác; nợ snapshot: NUMERIC(14,2)</w:t>
             </w:r>
           </w:p>
         </w:tc>
@@ -2166,7 +2308,7 @@
               <w:rPr>
                 <w:sz w:val="18"/>
               </w:rPr>
-              <w:t>Không chồng khoảng thuê phòng hoặc khoảng cư trú của cùng thành viên</w:t>
+              <w:t>Không trùng khoảng thuê cùng phòng; cùng người không trùng khoảng trong một hợp đồng</w:t>
             </w:r>
           </w:p>
         </w:tc>
@@ -2311,6 +2453,59 @@
               <w:rPr>
                 <w:sz w:val="18"/>
               </w:rPr>
+              <w:t>0..1–0..1</w:t>
+            </w:r>
+          </w:p>
+        </w:tc>
+        <w:tc>
+          <w:tcPr>
+            <w:tcW w:type="dxa" w:w="3364"/>
+          </w:tcPr>
+          <w:p>
+            <w:pPr>
+              <w:spacing w:after="60"/>
+            </w:pPr>
+            <w:r>
+              <w:rPr>
+                <w:sz w:val="18"/>
+              </w:rPr>
+              <w:t>Tài khoản–hồ sơ; chỉ số–dòng hóa đơn</w:t>
+            </w:r>
+          </w:p>
+        </w:tc>
+        <w:tc>
+          <w:tcPr>
+            <w:tcW w:type="dxa" w:w="3364"/>
+          </w:tcPr>
+          <w:p>
+            <w:pPr>
+              <w:spacing w:after="60"/>
+            </w:pPr>
+            <w:r>
+              <w:rPr>
+                <w:sz w:val="18"/>
+              </w:rPr>
+              <w:t>FK cho phép NULL + UNIQUE</w:t>
+            </w:r>
+          </w:p>
+        </w:tc>
+      </w:tr>
+      <w:tr>
+        <w:trPr>
+          <w:cantSplit/>
+        </w:trPr>
+        <w:tc>
+          <w:tcPr>
+            <w:tcW w:type="dxa" w:w="3364"/>
+          </w:tcPr>
+          <w:p>
+            <w:pPr>
+              <w:spacing w:after="60"/>
+            </w:pPr>
+            <w:r>
+              <w:rPr>
+                <w:sz w:val="18"/>
+              </w:rPr>
               <w:t>1–0..1</w:t>
             </w:r>
           </w:p>
@@ -2327,7 +2522,7 @@
               <w:rPr>
                 <w:sz w:val="18"/>
               </w:rPr>
-              <w:t>Tài khoản–hồ sơ; hợp đồng–quyết toán</w:t>
+              <w:t>Hợp đồng–quyết toán; chỉ số–cảnh báo</w:t>
             </w:r>
           </w:p>
         </w:tc>
@@ -2343,7 +2538,7 @@
               <w:rPr>
                 <w:sz w:val="18"/>
               </w:rPr>
-              <w:t>UNIQUE trên FK; liên kết tùy chọn</w:t>
+              <w:t>FK NOT NULL + UNIQUE ở bảng con</w:t>
             </w:r>
           </w:p>
         </w:tc>
@@ -2732,7 +2927,7 @@
               <w:rPr>
                 <w:sz w:val="18"/>
               </w:rPr>
-              <w:t>Thông tin chỉ phụ thuộc một phần khóa ghép</w:t>
+              <w:t>Thuộc tính phi khóa phụ thuộc một phần khóa ứng viên ghép</w:t>
             </w:r>
           </w:p>
         </w:tc>
@@ -2748,7 +2943,7 @@
               <w:rPr>
                 <w:sz w:val="18"/>
               </w:rPr>
-              <w:t>Không lưu họ tên ở thành viên; không lưu room_id ở chỉ số</w:t>
+              <w:t>tenant_id chỉ là một phần khóa cư trú: họ tên lưu tại tenant_profiles</w:t>
             </w:r>
           </w:p>
         </w:tc>
@@ -2785,7 +2980,7 @@
               <w:rPr>
                 <w:sz w:val="18"/>
               </w:rPr>
-              <w:t>Thông tin danh mục lặp qua bảng quan hệ</w:t>
+              <w:t>Phụ thuộc bắc cầu qua thuộc tính không phải siêu khóa</w:t>
             </w:r>
           </w:p>
         </w:tc>
@@ -2801,7 +2996,7 @@
               <w:rPr>
                 <w:sz w:val="18"/>
               </w:rPr>
-              <w:t>Hồ sơ người và danh mục dịch vụ lưu tại thực thể riêng</w:t>
+              <w:t>Sự cố chỉ lưu contract_id; suy ra room_id và property_id qua JOIN</w:t>
             </w:r>
           </w:p>
         </w:tc>
@@ -3452,7 +3647,7 @@
         <w:pStyle w:val="ListBullet"/>
       </w:pPr>
       <w:r>
-        <w:t>Dữ liệu minh họa; các khoản nợ khác giả định bằng 0.</w:t>
+        <w:t>Dữ liệu minh họa: trả ngày 01/10/2026; các kỳ trước đã thanh toán, không có khoản nợ khác.</w:t>
       </w:r>
     </w:p>
     <w:p>
@@ -3916,6 +4111,22 @@
               <w:rPr>
                 <w:sz w:val="18"/>
               </w:rPr>
+              <w:t>Nguyễn Doãn Huy / MSSV: …………</w:t>
+            </w:r>
+          </w:p>
+        </w:tc>
+        <w:tc>
+          <w:tcPr>
+            <w:tcW w:type="dxa" w:w="2523"/>
+          </w:tcPr>
+          <w:p>
+            <w:pPr>
+              <w:spacing w:after="60"/>
+            </w:pPr>
+            <w:r>
+              <w:rPr>
+                <w:sz w:val="18"/>
+              </w:rPr>
               <w:t>……………………</w:t>
             </w:r>
           </w:p>
@@ -3932,23 +4143,7 @@
               <w:rPr>
                 <w:sz w:val="18"/>
               </w:rPr>
-              <w:t>………………………………</w:t>
-            </w:r>
-          </w:p>
-        </w:tc>
-        <w:tc>
-          <w:tcPr>
-            <w:tcW w:type="dxa" w:w="2523"/>
-          </w:tcPr>
-          <w:p>
-            <w:pPr>
-              <w:spacing w:after="60"/>
-            </w:pPr>
-            <w:r>
-              <w:rPr>
-                <w:sz w:val="18"/>
-              </w:rPr>
-              <w:t>Tài liệu / commit</w:t>
+              <w:t>…………</w:t>
             </w:r>
           </w:p>
         </w:tc>
@@ -3985,6 +4180,22 @@
               <w:rPr>
                 <w:sz w:val="18"/>
               </w:rPr>
+              <w:t>Phan Văn Hiếu / MSSV: …………</w:t>
+            </w:r>
+          </w:p>
+        </w:tc>
+        <w:tc>
+          <w:tcPr>
+            <w:tcW w:type="dxa" w:w="2523"/>
+          </w:tcPr>
+          <w:p>
+            <w:pPr>
+              <w:spacing w:after="60"/>
+            </w:pPr>
+            <w:r>
+              <w:rPr>
+                <w:sz w:val="18"/>
+              </w:rPr>
               <w:t>……………………</w:t>
             </w:r>
           </w:p>
@@ -4001,23 +4212,7 @@
               <w:rPr>
                 <w:sz w:val="18"/>
               </w:rPr>
-              <w:t>………………………………</w:t>
-            </w:r>
-          </w:p>
-        </w:tc>
-        <w:tc>
-          <w:tcPr>
-            <w:tcW w:type="dxa" w:w="2523"/>
-          </w:tcPr>
-          <w:p>
-            <w:pPr>
-              <w:spacing w:after="60"/>
-            </w:pPr>
-            <w:r>
-              <w:rPr>
-                <w:sz w:val="18"/>
-              </w:rPr>
-              <w:t>Tài liệu / commit</w:t>
+              <w:t>…………</w:t>
             </w:r>
           </w:p>
         </w:tc>
@@ -4054,6 +4249,22 @@
               <w:rPr>
                 <w:sz w:val="18"/>
               </w:rPr>
+              <w:t>Nguyễn Trần Tuấn Khôi / MSSV: …………</w:t>
+            </w:r>
+          </w:p>
+        </w:tc>
+        <w:tc>
+          <w:tcPr>
+            <w:tcW w:type="dxa" w:w="2523"/>
+          </w:tcPr>
+          <w:p>
+            <w:pPr>
+              <w:spacing w:after="60"/>
+            </w:pPr>
+            <w:r>
+              <w:rPr>
+                <w:sz w:val="18"/>
+              </w:rPr>
               <w:t>……………………</w:t>
             </w:r>
           </w:p>
@@ -4070,23 +4281,7 @@
               <w:rPr>
                 <w:sz w:val="18"/>
               </w:rPr>
-              <w:t>………………………………</w:t>
-            </w:r>
-          </w:p>
-        </w:tc>
-        <w:tc>
-          <w:tcPr>
-            <w:tcW w:type="dxa" w:w="2523"/>
-          </w:tcPr>
-          <w:p>
-            <w:pPr>
-              <w:spacing w:after="60"/>
-            </w:pPr>
-            <w:r>
-              <w:rPr>
-                <w:sz w:val="18"/>
-              </w:rPr>
-              <w:t>Tài liệu / commit</w:t>
+              <w:t>…………</w:t>
             </w:r>
           </w:p>
         </w:tc>
@@ -4123,6 +4318,22 @@
               <w:rPr>
                 <w:sz w:val="18"/>
               </w:rPr>
+              <w:t>Nie Phương Anh / MSSV: …………</w:t>
+            </w:r>
+          </w:p>
+        </w:tc>
+        <w:tc>
+          <w:tcPr>
+            <w:tcW w:type="dxa" w:w="2523"/>
+          </w:tcPr>
+          <w:p>
+            <w:pPr>
+              <w:spacing w:after="60"/>
+            </w:pPr>
+            <w:r>
+              <w:rPr>
+                <w:sz w:val="18"/>
+              </w:rPr>
               <w:t>……………………</w:t>
             </w:r>
           </w:p>
@@ -4139,7 +4350,7 @@
               <w:rPr>
                 <w:sz w:val="18"/>
               </w:rPr>
-              <w:t>………………………………</w:t>
+              <w:t>…………</w:t>
             </w:r>
           </w:p>
         </w:tc>
@@ -4155,7 +4366,129 @@
               <w:rPr>
                 <w:sz w:val="18"/>
               </w:rPr>
-              <w:t>Tài liệu / commit</w:t>
+              <w:t>…… %</w:t>
+            </w:r>
+          </w:p>
+        </w:tc>
+      </w:tr>
+      <w:tr>
+        <w:trPr>
+          <w:cantSplit/>
+        </w:trPr>
+        <w:tc>
+          <w:tcPr>
+            <w:tcW w:type="dxa" w:w="2523"/>
+          </w:tcPr>
+          <w:p>
+            <w:pPr>
+              <w:spacing w:after="60"/>
+            </w:pPr>
+            <w:r>
+              <w:rPr>
+                <w:sz w:val="18"/>
+              </w:rPr>
+              <w:t>Trần Đức Nguyên / MSSV: …………</w:t>
+            </w:r>
+          </w:p>
+        </w:tc>
+        <w:tc>
+          <w:tcPr>
+            <w:tcW w:type="dxa" w:w="2523"/>
+          </w:tcPr>
+          <w:p>
+            <w:pPr>
+              <w:spacing w:after="60"/>
+            </w:pPr>
+            <w:r>
+              <w:rPr>
+                <w:sz w:val="18"/>
+              </w:rPr>
+              <w:t>……………………</w:t>
+            </w:r>
+          </w:p>
+        </w:tc>
+        <w:tc>
+          <w:tcPr>
+            <w:tcW w:type="dxa" w:w="2523"/>
+          </w:tcPr>
+          <w:p>
+            <w:pPr>
+              <w:spacing w:after="60"/>
+            </w:pPr>
+            <w:r>
+              <w:rPr>
+                <w:sz w:val="18"/>
+              </w:rPr>
+              <w:t>…………</w:t>
+            </w:r>
+          </w:p>
+        </w:tc>
+        <w:tc>
+          <w:tcPr>
+            <w:tcW w:type="dxa" w:w="2523"/>
+          </w:tcPr>
+          <w:p>
+            <w:pPr>
+              <w:spacing w:after="60"/>
+            </w:pPr>
+            <w:r>
+              <w:rPr>
+                <w:sz w:val="18"/>
+              </w:rPr>
+              <w:t>…… %</w:t>
+            </w:r>
+          </w:p>
+        </w:tc>
+      </w:tr>
+      <w:tr>
+        <w:trPr>
+          <w:cantSplit/>
+        </w:trPr>
+        <w:tc>
+          <w:tcPr>
+            <w:tcW w:type="dxa" w:w="2523"/>
+          </w:tcPr>
+          <w:p>
+            <w:pPr>
+              <w:spacing w:after="60"/>
+            </w:pPr>
+            <w:r>
+              <w:rPr>
+                <w:sz w:val="18"/>
+              </w:rPr>
+              <w:t>Nguyễn Quang Trung / MSSV: …………</w:t>
+            </w:r>
+          </w:p>
+        </w:tc>
+        <w:tc>
+          <w:tcPr>
+            <w:tcW w:type="dxa" w:w="2523"/>
+          </w:tcPr>
+          <w:p>
+            <w:pPr>
+              <w:spacing w:after="60"/>
+            </w:pPr>
+            <w:r>
+              <w:rPr>
+                <w:sz w:val="18"/>
+              </w:rPr>
+              <w:t>……………………</w:t>
+            </w:r>
+          </w:p>
+        </w:tc>
+        <w:tc>
+          <w:tcPr>
+            <w:tcW w:type="dxa" w:w="2523"/>
+          </w:tcPr>
+          <w:p>
+            <w:pPr>
+              <w:spacing w:after="60"/>
+            </w:pPr>
+            <w:r>
+              <w:rPr>
+                <w:sz w:val="18"/>
+              </w:rPr>
+              <w:t>…………</w:t>
             </w:r>
           </w:p>
         </w:tc>
@@ -7188,6 +7521,14 @@
       </w:pPr>
       <w:r>
         <w:t>DBML, SQL, view và trigger.</w:t>
+      </w:r>
+    </w:p>
+    <w:p>
+      <w:pPr>
+        <w:pStyle w:val="ListBullet"/>
+      </w:pPr>
+      <w:r>
+        <w:t>ERD trực tuyến trên dbdiagram.io.</w:t>
       </w:r>
     </w:p>
     <w:p>

</xml_diff>